<commit_message>
Viết lại mục II. Căn cứ xây dựng dự án theo Công văn 6438/BGDĐT-GDĐH
Bỏ căn cứ đầu tư công; bổ sung NĐ 104/2026, TT 73/2026, Luật 110/2025, Luật 36/2018, QĐ 995, QĐ 2719, CV 6438, Chuẩn chương trình tài năng STEM và quyết định ban hành chương trình tài năng (để trống số, tô vàng).

Co-Authored-By: Claude Opus 5.5 <noreply@anthropic.com>
Claude-Session: https://claude.ai/code/session_01JLkhnZKuapW5Zj7yjV8vMu
</commit_message>
<xml_diff>
--- a/Du an PTN cao hoc Hoa hoc/De cuong du an PTN cao hoc Hoa hoc - ban sua (bo he may tinh).docx
+++ b/Du an PTN cao hoc Hoa hoc/De cuong du an PTN cao hoc Hoa hoc - ban sua (bo he may tinh).docx
@@ -1259,13 +1259,10 @@
       </w:pPr>
       <w:r>
         <w:rPr>
-          <w:rFonts w:eastAsia="Times New Roman"/>
-          <w:color w:val="000000"/>
-          <w:sz w:val="24"/>
-          <w:szCs w:val="24"/>
-          <w:lang w:val="vi-VN"/>
-        </w:rPr>
-        <w:t>- Luật Đầu tư công số 58/2024/QH15 ngày 29/11/2024.</w:t>
+          <w:b/>
+          <w:sz w:val="24"/>
+        </w:rPr>
+        <w:t>1. Căn cứ pháp lý</w:t>
       </w:r>
     </w:p>
     <w:p>
@@ -1283,13 +1280,9 @@
       </w:pPr>
       <w:r>
         <w:rPr>
-          <w:rFonts w:eastAsia="Times New Roman"/>
-          <w:color w:val="000000"/>
-          <w:sz w:val="24"/>
-          <w:szCs w:val="24"/>
-          <w:lang w:val="vi-VN"/>
-        </w:rPr>
-        <w:t>- Nghị định số 85/2025/NĐ-CP ngày 08/4/2025 của Chính phủ quy định chi tiết thi hành một số điều của Luật Đầu tư công.</w:t>
+          <w:sz w:val="24"/>
+        </w:rPr>
+        <w:t>- Luật Ngân sách nhà nước và các văn bản hướng dẫn thi hành hiện hành.</w:t>
       </w:r>
     </w:p>
     <w:p>
@@ -1307,13 +1300,9 @@
       </w:pPr>
       <w:r>
         <w:rPr>
-          <w:rFonts w:eastAsia="Times New Roman"/>
-          <w:color w:val="000000"/>
-          <w:sz w:val="24"/>
-          <w:szCs w:val="24"/>
-          <w:lang w:val="vi-VN"/>
-        </w:rPr>
-        <w:t>- Luật Đấu thầu số 22/2023/QH15 ngày 23/6/2023 và các văn bản hướng dẫn thi hành còn hiệu lực.</w:t>
+          <w:sz w:val="24"/>
+        </w:rPr>
+        <w:t>- Luật Quản lý, sử dụng tài sản công số 15/2017/QH14 ngày 21/6/2017 và các luật sửa đổi, bổ sung.</w:t>
       </w:r>
     </w:p>
     <w:p>
@@ -1331,17 +1320,14 @@
       </w:pPr>
       <w:r>
         <w:rPr>
-          <w:rFonts w:eastAsia="Times New Roman"/>
-          <w:color w:val="000000"/>
-          <w:sz w:val="24"/>
-          <w:szCs w:val="24"/>
-          <w:lang w:val="vi-VN"/>
-        </w:rPr>
-        <w:t>- Nghị quyết số 57-NQ/TW ngày 22/12/2024 của Bộ Chính trị về đột phá phát triển khoa học, công nghệ, đổi mới sáng tạo và chuyển đổi số quốc gia; Nghị quyết số 71/NQ-CP ngày 01/4/2025 của Chính phủ ban hành chương trình hành động thực hiện Nghị quyết số 57-NQ/TW.</w:t>
+          <w:sz w:val="24"/>
+        </w:rPr>
+        <w:t>- Luật Đấu thầu số 22/2023/QH15 ngày 23/6/2023 và các văn bản hướng dẫn thi hành.</w:t>
       </w:r>
     </w:p>
     <w:p>
       <w:pPr>
+        <w:keepNext/>
         <w:snapToGrid w:val="0"/>
         <w:spacing w:before="120" w:line="312" w:lineRule="auto"/>
         <w:ind w:firstLine="426"/>
@@ -1354,27 +1340,14 @@
       </w:pPr>
       <w:r>
         <w:rPr>
-          <w:rFonts w:eastAsia="Times New Roman"/>
-          <w:color w:val="000000"/>
-          <w:sz w:val="24"/>
-          <w:szCs w:val="24"/>
-          <w:lang w:val="vi-VN"/>
-        </w:rPr>
-        <w:t>- Quyết định số 1002/QĐ-TTg ngày 24/5/2025 của Thủ tướng Chính phủ phê duyệt Đề án đào tạo nguồn nhân lực phục vụ phát triển công nghệ cao giai đoạn 2025-2035 và định hướng tới năm 2045</w:t>
-      </w:r>
-      <w:r>
-        <w:rPr>
-          <w:rFonts w:eastAsia="Times New Roman"/>
-          <w:color w:val="000000"/>
-          <w:sz w:val="24"/>
-          <w:szCs w:val="24"/>
-          <w:lang w:val="vi-VN"/>
-        </w:rPr>
-        <w:t>.</w:t>
+          <w:sz w:val="24"/>
+        </w:rPr>
+        <w:t>- Luật Tiết kiệm, chống lãng phí số 110/2025/QH15.</w:t>
       </w:r>
     </w:p>
     <w:p>
       <w:pPr>
+        <w:keepNext/>
         <w:snapToGrid w:val="0"/>
         <w:spacing w:before="120" w:line="312" w:lineRule="auto"/>
         <w:ind w:firstLine="426"/>
@@ -1387,27 +1360,14 @@
       </w:pPr>
       <w:r>
         <w:rPr>
-          <w:rFonts w:eastAsia="Times New Roman"/>
-          <w:color w:val="000000"/>
-          <w:sz w:val="24"/>
-          <w:szCs w:val="24"/>
-          <w:lang w:val="vi-VN"/>
-        </w:rPr>
-        <w:t>- Thông tư số 23/2021/TT-BGDĐT ngày 30/8/2021 ban hành Quy chế tuyển sinh và đào tạo trình độ thạc sĩ</w:t>
-      </w:r>
-      <w:r>
-        <w:rPr>
-          <w:rFonts w:eastAsia="Times New Roman"/>
-          <w:color w:val="000000"/>
-          <w:sz w:val="24"/>
-          <w:szCs w:val="24"/>
-          <w:lang w:val="vi-VN"/>
-        </w:rPr>
-        <w:t>.</w:t>
+          <w:sz w:val="24"/>
+        </w:rPr>
+        <w:t>- Luật Phòng, chống tham nhũng số 36/2018/QH14 ngày 20/11/2018 và các luật sửa đổi, bổ sung.</w:t>
       </w:r>
     </w:p>
     <w:p>
       <w:pPr>
+        <w:keepNext/>
         <w:snapToGrid w:val="0"/>
         <w:spacing w:before="120" w:line="312" w:lineRule="auto"/>
         <w:ind w:firstLine="426"/>
@@ -1420,17 +1380,14 @@
       </w:pPr>
       <w:r>
         <w:rPr>
-          <w:rFonts w:eastAsia="Times New Roman"/>
-          <w:color w:val="000000"/>
-          <w:sz w:val="24"/>
-          <w:szCs w:val="24"/>
-          <w:lang w:val="vi-VN"/>
-        </w:rPr>
-        <w:t>- Quyết định số 3718/QĐ-KHTN ngày 02/12/2024 của Hiệu trưởng Trường Đại học Khoa học tự nhiên, ĐHQG-HCM ban hành Khung chương trình đào tạo thạc sĩ ngành Hóa học áp dụng khóa năm 2024.</w:t>
+          <w:sz w:val="24"/>
+        </w:rPr>
+        <w:t>- Nghị định số 104/2026/NĐ-CP ngày 31/3/2026 của Chính phủ quy định về lập dự toán, quản lý, sử dụng và quyết toán kinh phí chi thường xuyên ngân sách nhà nước.</w:t>
       </w:r>
     </w:p>
     <w:p>
       <w:pPr>
+        <w:keepNext/>
         <w:snapToGrid w:val="0"/>
         <w:spacing w:before="120" w:line="312" w:lineRule="auto"/>
         <w:ind w:firstLine="426"/>
@@ -1443,18 +1400,14 @@
       </w:pPr>
       <w:r>
         <w:rPr>
-          <w:rFonts w:eastAsia="Times New Roman"/>
-          <w:color w:val="000000"/>
-          <w:sz w:val="24"/>
-          <w:szCs w:val="24"/>
-          <w:lang w:val="vi-VN"/>
-        </w:rPr>
-        <w:lastRenderedPageBreak/>
-        <w:t>- Khung chương trình đào tạo thạc sĩ ngành Hóa học áp dụng khóa năm 2024 quy định chương trình nghiên cứu theo Phương thức 1 và yêu cầu công bố khoa học hoặc kết quả sở hữu trí tuệ trước khi bảo vệ luận văn; đây là căn cứ trực tiếp xác định nhu cầu về thiết bị nghiên cứu, phân tích và đặc trưng dùng chung.</w:t>
+          <w:sz w:val="24"/>
+        </w:rPr>
+        <w:t>- Thông tư số 73/2026/TT-BGDĐT ngày 28/8/2026 của Bộ trưởng Bộ Giáo dục và Đào tạo quy định về quản lý, sử dụng tài sản công; mua sắm, sửa chữa, cải tạo, nâng cấp tài sản công và phân cấp thẩm quyền.</w:t>
       </w:r>
     </w:p>
     <w:p>
       <w:pPr>
+        <w:keepNext/>
         <w:snapToGrid w:val="0"/>
         <w:spacing w:before="120" w:line="312" w:lineRule="auto"/>
         <w:ind w:firstLine="426"/>
@@ -1467,17 +1420,14 @@
       </w:pPr>
       <w:r>
         <w:rPr>
-          <w:rFonts w:eastAsia="Times New Roman"/>
-          <w:color w:val="000000"/>
-          <w:sz w:val="24"/>
-          <w:szCs w:val="24"/>
-          <w:lang w:val="vi-VN"/>
-        </w:rPr>
-        <w:t>- Khung chương trình đào tạo thạc sĩ chuyên ngành Giảng dạy Hóa học thực nghiệm áp dụng khóa năm 2024, trong đó các học phần có thành phần thực hành, thí nghiệm và đồ án, là căn cứ bổ sung cho phương án khai thác thiết bị phục vụ đào tạo hóa học thực nghiệm và dùng chung trong Khoa Hóa học.</w:t>
+          <w:sz w:val="24"/>
+        </w:rPr>
+        <w:t>- Thông tư số 23/2021/TT-BGDĐT ngày 30/8/2021 của Bộ trưởng Bộ Giáo dục và Đào tạo ban hành Quy chế tuyển sinh và đào tạo trình độ thạc sĩ.</w:t>
       </w:r>
     </w:p>
     <w:p>
       <w:pPr>
+        <w:keepNext/>
         <w:snapToGrid w:val="0"/>
         <w:spacing w:before="120" w:line="312" w:lineRule="auto"/>
         <w:ind w:firstLine="426"/>
@@ -1490,13 +1440,218 @@
       </w:pPr>
       <w:r>
         <w:rPr>
-          <w:rFonts w:eastAsia="Times New Roman"/>
-          <w:color w:val="000000"/>
-          <w:sz w:val="24"/>
-          <w:szCs w:val="24"/>
-          <w:lang w:val="vi-VN"/>
-        </w:rPr>
-        <w:t>- Đề án mở ngành đào tạo trình độ tiến sĩ ngành Hóa học, mã ngành 9440112, sau thẩm định năm 2026, quy định nghiên cứu sinh Phương thức 1 phải là tác giả chính của ít nhất 03 báo cáo hội nghị hoặc bài báo thuộc Web of Science, Scopus hoặc tương đương, trong đó có ít nhất 01 bài Q2 hoặc 01 báo cáo hội nghị hạng B trở lên; đồng thời xác định hệ thống phòng thí nghiệm phục vụ nghiên cứu và luận án tiến sĩ.</w:t>
+          <w:b/>
+          <w:sz w:val="24"/>
+        </w:rPr>
+        <w:t>2. Căn cứ chủ trương, chính sách</w:t>
+      </w:r>
+    </w:p>
+    <w:p>
+      <w:pPr>
+        <w:keepNext/>
+        <w:snapToGrid w:val="0"/>
+        <w:spacing w:before="120" w:line="312" w:lineRule="auto"/>
+        <w:ind w:firstLine="426"/>
+        <w:jc w:val="both"/>
+        <w:rPr>
+          <w:sz w:val="24"/>
+          <w:szCs w:val="24"/>
+          <w:lang w:val="vi-VN"/>
+        </w:rPr>
+      </w:pPr>
+      <w:r>
+        <w:rPr>
+          <w:sz w:val="24"/>
+        </w:rPr>
+        <w:t>- Nghị quyết số 57-NQ/TW ngày 22/12/2024 của Bộ Chính trị về đột phá phát triển khoa học, công nghệ, đổi mới sáng tạo và chuyển đổi số quốc gia; Nghị quyết số 71/NQ-CP ngày 01/4/2025 của Chính phủ ban hành Chương trình hành động thực hiện Nghị quyết số 57-NQ/TW.</w:t>
+      </w:r>
+    </w:p>
+    <w:p>
+      <w:pPr>
+        <w:keepNext/>
+        <w:snapToGrid w:val="0"/>
+        <w:spacing w:before="120" w:line="312" w:lineRule="auto"/>
+        <w:ind w:firstLine="426"/>
+        <w:jc w:val="both"/>
+        <w:rPr>
+          <w:sz w:val="24"/>
+          <w:szCs w:val="24"/>
+          <w:lang w:val="vi-VN"/>
+        </w:rPr>
+      </w:pPr>
+      <w:r>
+        <w:rPr>
+          <w:sz w:val="24"/>
+        </w:rPr>
+        <w:t>- Quyết định số 1002/QĐ-TTg ngày 24/5/2025 của Thủ tướng Chính phủ phê duyệt Đề án "Đào tạo nguồn nhân lực phục vụ phát triển công nghệ cao giai đoạn 2025 - 2035 và định hướng tới năm 2045" (Đề án 1002).</w:t>
+      </w:r>
+    </w:p>
+    <w:p>
+      <w:pPr>
+        <w:keepNext/>
+        <w:snapToGrid w:val="0"/>
+        <w:spacing w:before="120" w:line="312" w:lineRule="auto"/>
+        <w:ind w:firstLine="426"/>
+        <w:jc w:val="both"/>
+        <w:rPr>
+          <w:sz w:val="24"/>
+          <w:szCs w:val="24"/>
+          <w:lang w:val="vi-VN"/>
+        </w:rPr>
+      </w:pPr>
+      <w:r>
+        <w:rPr>
+          <w:b/>
+          <w:sz w:val="24"/>
+        </w:rPr>
+        <w:t>3. Căn cứ chỉ đạo, hướng dẫn của Bộ Giáo dục và Đào tạo</w:t>
+      </w:r>
+    </w:p>
+    <w:p>
+      <w:pPr>
+        <w:keepNext/>
+        <w:snapToGrid w:val="0"/>
+        <w:spacing w:before="120" w:line="312" w:lineRule="auto"/>
+        <w:ind w:firstLine="426"/>
+        <w:jc w:val="both"/>
+        <w:rPr>
+          <w:sz w:val="24"/>
+          <w:szCs w:val="24"/>
+          <w:lang w:val="vi-VN"/>
+        </w:rPr>
+      </w:pPr>
+      <w:r>
+        <w:rPr>
+          <w:sz w:val="24"/>
+        </w:rPr>
+        <w:t xml:space="preserve">- Chuẩn chương trình đào tạo kỹ sư, thạc sĩ tài năng thuộc các lĩnh vực STEM ban hành kèm theo </w:t>
+      </w:r>
+      <w:r>
+        <w:rPr>
+          <w:sz w:val="24"/>
+          <w:highlight w:val="yellow"/>
+        </w:rPr>
+        <w:t>[Quyết định/Thông tư số ... ngày ...]</w:t>
+      </w:r>
+      <w:r>
+        <w:rPr>
+          <w:sz w:val="24"/>
+        </w:rPr>
+        <w:t xml:space="preserve"> của Bộ trưởng Bộ Giáo dục và Đào tạo.</w:t>
+      </w:r>
+    </w:p>
+    <w:p>
+      <w:pPr>
+        <w:keepNext/>
+        <w:snapToGrid w:val="0"/>
+        <w:spacing w:before="120" w:line="312" w:lineRule="auto"/>
+        <w:ind w:firstLine="426"/>
+        <w:jc w:val="both"/>
+        <w:rPr>
+          <w:sz w:val="24"/>
+          <w:szCs w:val="24"/>
+          <w:lang w:val="vi-VN"/>
+        </w:rPr>
+      </w:pPr>
+      <w:r>
+        <w:rPr>
+          <w:sz w:val="24"/>
+        </w:rPr>
+        <w:t>- Quyết định số 995/QĐ-BGDĐT ngày 23/4/2026 và Quyết định số 2719/QĐ-BGDĐT ngày 16/9/2026 của Bộ trưởng Bộ Giáo dục và Đào tạo phê duyệt danh sách chương trình, cơ sở đào tạo tham gia chương trình đào tạo kỹ sư, thạc sĩ tài năng thuộc các lĩnh vực STEM theo Đề án 1002, trong đó có Trường Đại học Khoa học tự nhiên, ĐHQG-HCM.</w:t>
+      </w:r>
+    </w:p>
+    <w:p>
+      <w:pPr>
+        <w:keepNext/>
+        <w:snapToGrid w:val="0"/>
+        <w:spacing w:before="120" w:line="312" w:lineRule="auto"/>
+        <w:ind w:firstLine="426"/>
+        <w:jc w:val="both"/>
+        <w:rPr>
+          <w:sz w:val="24"/>
+          <w:szCs w:val="24"/>
+          <w:lang w:val="vi-VN"/>
+        </w:rPr>
+      </w:pPr>
+      <w:r>
+        <w:rPr>
+          <w:sz w:val="24"/>
+        </w:rPr>
+        <w:t>- Công văn số 6438/BGDĐT-GDĐH ngày 21/9/2026 của Bộ Giáo dục và Đào tạo về việc xây dựng Dự án đề xuất đầu tư trang thiết bị, phòng thực hành, thí nghiệm phục vụ các chương trình đào tạo tài năng thuộc các lĩnh vực STEM được phê duyệt.</w:t>
+      </w:r>
+    </w:p>
+    <w:p>
+      <w:pPr>
+        <w:keepNext/>
+        <w:snapToGrid w:val="0"/>
+        <w:spacing w:before="120" w:line="312" w:lineRule="auto"/>
+        <w:ind w:firstLine="426"/>
+        <w:jc w:val="both"/>
+        <w:rPr>
+          <w:sz w:val="24"/>
+          <w:szCs w:val="24"/>
+          <w:lang w:val="vi-VN"/>
+        </w:rPr>
+      </w:pPr>
+      <w:r>
+        <w:rPr>
+          <w:b/>
+          <w:sz w:val="24"/>
+        </w:rPr>
+        <w:t>4. Căn cứ của cơ sở đào tạo</w:t>
+      </w:r>
+    </w:p>
+    <w:p>
+      <w:pPr>
+        <w:keepNext/>
+        <w:snapToGrid w:val="0"/>
+        <w:spacing w:before="120" w:line="312" w:lineRule="auto"/>
+        <w:ind w:firstLine="426"/>
+        <w:jc w:val="both"/>
+        <w:rPr>
+          <w:sz w:val="24"/>
+          <w:szCs w:val="24"/>
+          <w:lang w:val="vi-VN"/>
+        </w:rPr>
+      </w:pPr>
+      <w:r>
+        <w:rPr>
+          <w:sz w:val="24"/>
+        </w:rPr>
+        <w:t xml:space="preserve">- Quyết định số </w:t>
+      </w:r>
+      <w:r>
+        <w:rPr>
+          <w:sz w:val="24"/>
+          <w:highlight w:val="yellow"/>
+        </w:rPr>
+        <w:t>.../QĐ-KHTN ngày .../.../2026</w:t>
+      </w:r>
+      <w:r>
+        <w:rPr>
+          <w:sz w:val="24"/>
+        </w:rPr>
+        <w:t xml:space="preserve"> của Hiệu trưởng Trường Đại học Khoa học tự nhiên, ĐHQG-HCM ban hành Chương trình đào tạo thạc sĩ tài năng ngành Hóa học.</w:t>
+      </w:r>
+    </w:p>
+    <w:p>
+      <w:pPr>
+        <w:keepNext/>
+        <w:snapToGrid w:val="0"/>
+        <w:spacing w:before="120" w:line="312" w:lineRule="auto"/>
+        <w:ind w:firstLine="426"/>
+        <w:jc w:val="both"/>
+        <w:rPr>
+          <w:sz w:val="24"/>
+          <w:szCs w:val="24"/>
+          <w:lang w:val="vi-VN"/>
+        </w:rPr>
+      </w:pPr>
+      <w:r>
+        <w:rPr>
+          <w:sz w:val="24"/>
+        </w:rPr>
+        <w:t>- Quyết định số 3718/QĐ-KHTN ngày 02/12/2024 của Hiệu trưởng Trường Đại học Khoa học tự nhiên, ĐHQG-HCM ban hành Khung chương trình đào tạo thạc sĩ ngành Hóa học áp dụng khóa năm 2024, trong đó chương trình nghiên cứu theo Phương thức 1 yêu cầu công bố khoa học hoặc kết quả sở hữu trí tuệ trước khi bảo vệ luận văn.</w:t>
       </w:r>
     </w:p>
     <w:p>

</xml_diff>